<commit_message>
Attestation: redate to October 30, 2026
Reaffirms the passwordless MFA attestation as of the date the
KSI-IAM-APM configuration evidence is published to the Trust Center.

Co-Authored-By: Claude Opus 5.5 <noreply@anthropic.com>
Claude-Session: https://claude.ai/code/session_01QqdRwbgxpbgZLeo3nnYUym
</commit_message>
<xml_diff>
--- a/JupiterOne_Passwordless_MFA_Attestation.docx
+++ b/JupiterOne_Passwordless_MFA_Attestation.docx
@@ -33,7 +33,7 @@
           <w:bCs w:val="1"/>
           <w:rtl w:val="0"/>
         </w:rPr>
-        <w:t xml:space="preserve">August 10, 2026</w:t>
+        <w:t xml:space="preserve">October 30, 2026</w:t>
       </w:r>
       <w:r>
         <w:rPr>
@@ -235,7 +235,7 @@
         <w:t xml:space="preserve">JupiterOne, Inc.</w:t>
         <w:br w:type="textWrapping"/>
         <w:br w:type="textWrapping"/>
-        <w:t xml:space="preserve">August 10, 2026</w:t>
+        <w:t xml:space="preserve">October 30, 2026</w:t>
       </w:r>
     </w:p>
     <w:sectPr>

</xml_diff>